<commit_message>
Remove 13 editorial review notes from current bylaws and policy readers and exports
</commit_message>
<xml_diff>
--- a/assets/governance/bylaws.docx
+++ b/assets/governance/bylaws.docx
@@ -72,12 +72,7 @@
         <w:jc w:val="center"/>
       </w:pPr>
       <w:r>
-        <w:rPr>
-          <w:rFonts w:ascii="Calibri" w:hAnsi="Calibri"/>
-          <w:b w:val="0"/>
-          <w:color w:val="111111"/>
-        </w:rPr>
-        <w:t>Board review version   October 19 2026</w:t>
+        <w:t>October 19 2026</w:t>
       </w:r>
     </w:p>
     <w:p>
@@ -250,11 +245,7 @@
         <w:spacing w:before="300"/>
       </w:pPr>
       <w:r>
-        <w:rPr>
-          <w:color w:val="555555"/>
-          <w:sz w:val="20"/>
-        </w:rPr>
-        <w:t>Select a heading to jump to that section. Review notes identify conditions to resolve before adoption.</w:t>
+        <w:t>Select a heading to jump to that section.</w:t>
       </w:r>
     </w:p>
     <w:p>
@@ -295,21 +286,6 @@
           <w:color w:val="111111"/>
         </w:rPr>
         <w:t>The Club is BoneShakers Social Club, also identified in existing records as BSSC C3. Its purposes are fellowship among motorcycle enthusiasts and nonriders who share its values, community service, charitable fundraising, and assistance to people in need, particularly within Hampton Roads. Its activities must remain consistent with its Articles of Incorporation and applicable charitable and tax requirements.</w:t>
-      </w:r>
-    </w:p>
-    <w:p>
-      <w:pPr>
-        <w:spacing w:before="120"/>
-      </w:pPr>
-      <w:r>
-        <w:rPr>
-          <w:rFonts w:ascii="Calibri" w:hAnsi="Calibri"/>
-          <w:b w:val="0"/>
-          <w:i/>
-          <w:color w:val="555555"/>
-          <w:sz w:val="20"/>
-        </w:rPr>
-        <w:t>Review note R1: Todd supplied the one-page BSSC C3 Articles filed September 5, 2022, filing 2209054920863. They leave member classes, qualifications and rights to the bylaws and require directors to be elected by members. The supplied complete seven-filing SCC history lists no Articles amendment or restatement after formation. The legal relationship with the 2005 corporation remains unverified. Confirm the governing entity/name and reconcile presidential director protection and the continuity seat with the Articles before adoption; this draft does not establish a merger or assumed name.</w:t>
       </w:r>
     </w:p>
     <w:p>
@@ -603,21 +579,6 @@
           <w:color w:val="111111"/>
         </w:rPr>
         <w:t>Reinstatement requires a majority Board recommendation, a majority membership approval vote with a quorum, current membership paperwork, and applicable payment. Until activation, the applicant has no active-member voting, office eligibility, or unrestricted confidential access. Independently retained historical patch permissions remain separate.</w:t>
-      </w:r>
-    </w:p>
-    <w:p>
-      <w:pPr>
-        <w:spacing w:before="120"/>
-      </w:pPr>
-      <w:r>
-        <w:rPr>
-          <w:rFonts w:ascii="Calibri" w:hAnsi="Calibri"/>
-          <w:b w:val="0"/>
-          <w:i/>
-          <w:color w:val="555555"/>
-          <w:sz w:val="20"/>
-        </w:rPr>
-        <w:t>Review note R2: The draft measures the two-completed-year eligibility window when the Board authorizes entry. Confirm this implementation detail before adoption so administrative delay does not change the route.</w:t>
       </w:r>
     </w:p>
     <w:p>
@@ -1024,21 +985,6 @@
     </w:p>
     <w:p>
       <w:pPr>
-        <w:spacing w:before="120"/>
-      </w:pPr>
-      <w:r>
-        <w:rPr>
-          <w:rFonts w:ascii="Calibri" w:hAnsi="Calibri"/>
-          <w:b w:val="0"/>
-          <w:i/>
-          <w:color w:val="555555"/>
-          <w:sz w:val="20"/>
-        </w:rPr>
-        <w:t>Review note R3: A successor completing only the unexpired part of another President's term has not completed a full elected presidential term. Any recognition exception requires the separate authorized decision; it is not automatic.</w:t>
-      </w:r>
-    </w:p>
-    <w:p>
-      <w:pPr>
         <w:pStyle w:val="Heading2"/>
       </w:pPr>
       <w:r>
@@ -1105,21 +1051,6 @@
           <w:color w:val="111111"/>
         </w:rPr>
         <w:t>Lifers and Past Presidents leaving in good standing without joining another related club may retain and wear their club patches, including the back patch and applicable recognition patch, without claiming current membership or office. Expelled members must return club-owned insignia. A later related-club affiliation ends the retention and display permission and triggers return within seven calendar days of the triggering affiliation. A documented extension does not waive the obligation. Other Club assets, funds, and records must still be returned.</w:t>
-      </w:r>
-    </w:p>
-    <w:p>
-      <w:pPr>
-        <w:spacing w:before="120"/>
-      </w:pPr>
-      <w:r>
-        <w:rPr>
-          <w:rFonts w:ascii="Calibri" w:hAnsi="Calibri"/>
-          <w:b w:val="0"/>
-          <w:i/>
-          <w:color w:val="555555"/>
-          <w:sz w:val="20"/>
-        </w:rPr>
-        <w:t>Review note R4: The Board is as the authority to document a return extension. Confirm notice and enforcement mechanics; no new unilateral forfeiture or seizure power is created.</w:t>
       </w:r>
     </w:p>
     <w:p>
@@ -1209,21 +1140,6 @@
     </w:p>
     <w:p>
       <w:pPr>
-        <w:spacing w:before="120"/>
-      </w:pPr>
-      <w:r>
-        <w:rPr>
-          <w:rFonts w:ascii="Calibri" w:hAnsi="Calibri"/>
-          <w:b w:val="0"/>
-          <w:i/>
-          <w:color w:val="555555"/>
-          <w:sz w:val="20"/>
-        </w:rPr>
-        <w:t>Review note R5: Verify any future remote-membership-meeting attendance method before counting it toward quorum. The approved ability to submit a ballot remotely does not itself create a remote meeting.</w:t>
-      </w:r>
-    </w:p>
-    <w:p>
-      <w:pPr>
         <w:pStyle w:val="Heading2"/>
       </w:pPr>
       <w:r>
@@ -1279,21 +1195,6 @@
           <w:color w:val="111111"/>
         </w:rPr>
         <w:t>Notices may be delivered personally or through authorized mail, email, text, or electronic channels that meet applicable requirements. The Secretary retains notices, voter-eligibility records, proxy authorizations, vote totals, and minutes. A record date or adjournment must not override the explicit renewal deadline or applicable law.</w:t>
-      </w:r>
-    </w:p>
-    <w:p>
-      <w:pPr>
-        <w:spacing w:before="120"/>
-      </w:pPr>
-      <w:r>
-        <w:rPr>
-          <w:rFonts w:ascii="Calibri" w:hAnsi="Calibri"/>
-          <w:b w:val="0"/>
-          <w:i/>
-          <w:color w:val="555555"/>
-          <w:sz w:val="20"/>
-        </w:rPr>
-        <w:t>Review note R6: The source permits a record date within 70 days before a meeting and a new record date after an adjournment exceeding 120 days. Retain those limits pending verification against the Articles and current law before finalizing this section.</w:t>
       </w:r>
     </w:p>
     <w:p>
@@ -1846,21 +1747,6 @@
     </w:p>
     <w:p>
       <w:pPr>
-        <w:spacing w:before="120"/>
-      </w:pPr>
-      <w:r>
-        <w:rPr>
-          <w:rFonts w:ascii="Calibri" w:hAnsi="Calibri"/>
-          <w:b w:val="0"/>
-          <w:i/>
-          <w:color w:val="555555"/>
-          <w:sz w:val="20"/>
-        </w:rPr>
-        <w:t>Review note R7: The voting system is not built or security-tested by adopting this text. Preserve a paper option and the source's three neutral manual counters until an alternative manual procedure is expressly adopted. Secret ballots remain required where specified.</w:t>
-      </w:r>
-    </w:p>
-    <w:p>
-      <w:pPr>
         <w:pStyle w:val="Heading2"/>
       </w:pPr>
       <w:r>
@@ -2087,12 +1973,7 @@
     <w:p>
       <w:pPr/>
       <w:r>
-        <w:rPr>
-          <w:rFonts w:ascii="Calibri" w:hAnsi="Calibri"/>
-          <w:b w:val="0"/>
-          <w:color w:val="111111"/>
-        </w:rPr>
-        <w:t>If a valid elected director term overlaps the outgoing President's continuity year, the person counts once and has one vote. Expiration of the continuity year does not end a longer valid elected director term. Seek volunteers first for any necessary one-time extensions to establish rotation. Such extensions take effect only through formal approval of a separate named transition schedule stating authority and end dates; no unexpired term is shortened. Review note R9: Verify actual incumbent term records and formal transition authority. This provision creates no permanent power for the Board to extend its own terms.</w:t>
+        <w:t>If a valid elected director term overlaps the outgoing President's continuity year, the person counts once and has one vote. Expiration of the continuity year does not end a longer valid elected director term. Seek volunteers first for any necessary one-time extensions to establish rotation. Such extensions take effect only through formal approval of a separate named transition schedule stating authority and end dates; no unexpired term is shortened. This provision creates no permanent power for the Board to extend its own terms.</w:t>
       </w:r>
     </w:p>
     <w:p>
@@ -3071,12 +2952,7 @@
     <w:p>
       <w:pPr/>
       <w:r>
-        <w:rPr>
-          <w:rFonts w:ascii="Calibri" w:hAnsi="Calibri"/>
-          <w:b w:val="0"/>
-          <w:color w:val="111111"/>
-        </w:rPr>
-        <w:t>Under D-186, Schedule A sections 4 through 6 clarify impartial approval, written repayment undertakings and lawful authority for further indemnity. A beneficiary does not vote on their own payment; use a lawful alternative route where recusal prevents director approval. Record the request, governing standard, eligible decision makers, vote or counsel determination, amount and repayment undertaking where applicable. Review note R12: Verify existing-rights and adoption history before final adoption; this clarification does not certify a particular claim. Schedule A remains part of the bylaws, not an administratively amendable policy.</w:t>
+        <w:t>Under D-186, Schedule A sections 4 through 6 clarify impartial approval, written repayment undertakings and lawful authority for further indemnity. A beneficiary does not vote on their own payment; use a lawful alternative route where recusal prevents director approval. Record the request, governing standard, eligible decision makers, vote or counsel determination, amount and repayment undertaking where applicable. Schedule A remains part of the bylaws, not an administratively amendable policy.</w:t>
       </w:r>
     </w:p>
     <w:p>
@@ -3456,6 +3332,7 @@
       <w:headerReference w:type="default" r:id="rId9"/>
       <w:footerReference w:type="default" r:id="rId10"/>
       <w:footerReference w:type="first" r:id="rId12"/>
+      <w:headerReference w:type="first" r:id="rId13"/>
       <w:pgSz w:w="12240" w:h="15840"/>
       <w:pgMar w:top="1080" w:right="1152" w:bottom="1008" w:left="1152" w:header="432" w:footer="432" w:gutter="0"/>
       <w:cols w:space="720"/>
@@ -3481,7 +3358,7 @@
         <w:color w:val="555555"/>
         <w:sz w:val="16"/>
       </w:rPr>
-      <w:t>BOARD REVIEW  •  OCTOBER 19 2026</w:t>
+      <w:t>OCTOBER 19 2026</w:t>
       <w:tab/>
     </w:r>
     <w:fldSimple w:instr="PAGE"/>
@@ -3496,13 +3373,6 @@
       <w:pStyle w:val="Footer"/>
       <w:jc w:val="center"/>
     </w:pPr>
-    <w:r>
-      <w:rPr>
-        <w:color w:val="555555"/>
-        <w:sz w:val="18"/>
-      </w:rPr>
-      <w:t>DOCUMENT   •   NOT YET ADOPTED</w:t>
-    </w:r>
   </w:p>
 </w:ftr>
 </file>
@@ -3521,6 +3391,16 @@
       </w:rPr>
       <w:t>BONESHAKERS SOCIAL CLUB   |   BYLAWS</w:t>
     </w:r>
+  </w:p>
+</w:hdr>
+</file>
+
+<file path=word/header2.xml><?xml version="1.0" encoding="utf-8"?>
+<w:hdr xmlns:m="http://schemas.openxmlformats.org/officeDocument/2006/math" xmlns:mc="http://schemas.openxmlformats.org/markup-compatibility/2006" xmlns:mo="http://schemas.microsoft.com/office/mac/office/2008/main" xmlns:mv="urn:schemas-microsoft-com:mac:vml" xmlns:o="urn:schemas-microsoft-com:office:office" xmlns:r="http://schemas.openxmlformats.org/officeDocument/2006/relationships" xmlns:v="urn:schemas-microsoft-com:vml" xmlns:w10="urn:schemas-microsoft-com:office:word" xmlns:w14="http://schemas.microsoft.com/office/word/2010/wordml" xmlns:w="http://schemas.openxmlformats.org/wordprocessingml/2006/main" xmlns:wne="http://schemas.microsoft.com/office/word/2006/wordml" xmlns:wp14="http://schemas.microsoft.com/office/word/2010/wordprocessingDrawing" xmlns:wp="http://schemas.openxmlformats.org/drawingml/2006/wordprocessingDrawing" xmlns:wpc="http://schemas.microsoft.com/office/word/2010/wordprocessingCanvas" xmlns:wpg="http://schemas.microsoft.com/office/word/2010/wordprocessingGroup" xmlns:wpi="http://schemas.microsoft.com/office/word/2010/wordprocessingInk" xmlns:wps="http://schemas.microsoft.com/office/word/2010/wordprocessingShape" mc:Ignorable="w14 wp14">
+  <w:p>
+    <w:pPr>
+      <w:pStyle w:val="Header"/>
+    </w:pPr>
   </w:p>
 </w:hdr>
 </file>

</xml_diff>

<commit_message>
Improve governance documents with 12-point text, double-size logo and centered clickable contents
</commit_message>
<xml_diff>
--- a/assets/governance/bylaws.docx
+++ b/assets/governance/bylaws.docx
@@ -10,7 +10,7 @@
       <w:r>
         <w:drawing>
           <wp:inline xmlns:a="http://schemas.openxmlformats.org/drawingml/2006/main" xmlns:pic="http://schemas.openxmlformats.org/drawingml/2006/picture">
-            <wp:extent cx="1645920" cy="1645920"/>
+            <wp:extent cx="3291840" cy="3291840"/>
             <wp:docPr id="1" name="Picture 1"/>
             <wp:cNvGraphicFramePr>
               <a:graphicFrameLocks noChangeAspect="1"/>
@@ -31,7 +31,7 @@
                   <pic:spPr>
                     <a:xfrm>
                       <a:off x="0" y="0"/>
-                      <a:ext cx="1645920" cy="1645920"/>
+                      <a:ext cx="3291840" cy="3291840"/>
                     </a:xfrm>
                     <a:prstGeom prst="rect"/>
                   </pic:spPr>
@@ -79,6 +79,7 @@
       <w:pPr>
         <w:pStyle w:val="Heading1"/>
         <w:pageBreakBefore/>
+        <w:jc w:val="center"/>
       </w:pPr>
       <w:r>
         <w:t>Contents</w:t>
@@ -87,6 +88,7 @@
     <w:p>
       <w:pPr>
         <w:spacing w:after="220"/>
+        <w:jc w:val="center"/>
       </w:pPr>
       <w:hyperlink w:anchor="bssc_section_1">
         <w:r>
@@ -100,6 +102,7 @@
     <w:p>
       <w:pPr>
         <w:spacing w:after="220"/>
+        <w:jc w:val="center"/>
       </w:pPr>
       <w:hyperlink w:anchor="bssc_section_2">
         <w:r>
@@ -113,6 +116,7 @@
     <w:p>
       <w:pPr>
         <w:spacing w:after="220"/>
+        <w:jc w:val="center"/>
       </w:pPr>
       <w:hyperlink w:anchor="bssc_section_3">
         <w:r>
@@ -126,6 +130,7 @@
     <w:p>
       <w:pPr>
         <w:spacing w:after="220"/>
+        <w:jc w:val="center"/>
       </w:pPr>
       <w:hyperlink w:anchor="bssc_section_4">
         <w:r>
@@ -139,6 +144,7 @@
     <w:p>
       <w:pPr>
         <w:spacing w:after="220"/>
+        <w:jc w:val="center"/>
       </w:pPr>
       <w:hyperlink w:anchor="bssc_section_5">
         <w:r>
@@ -152,6 +158,7 @@
     <w:p>
       <w:pPr>
         <w:spacing w:after="220"/>
+        <w:jc w:val="center"/>
       </w:pPr>
       <w:hyperlink w:anchor="bssc_section_6">
         <w:r>
@@ -165,6 +172,7 @@
     <w:p>
       <w:pPr>
         <w:spacing w:after="220"/>
+        <w:jc w:val="center"/>
       </w:pPr>
       <w:hyperlink w:anchor="bssc_section_7">
         <w:r>
@@ -178,6 +186,7 @@
     <w:p>
       <w:pPr>
         <w:spacing w:after="220"/>
+        <w:jc w:val="center"/>
       </w:pPr>
       <w:hyperlink w:anchor="bssc_section_8">
         <w:r>
@@ -191,6 +200,7 @@
     <w:p>
       <w:pPr>
         <w:spacing w:after="220"/>
+        <w:jc w:val="center"/>
       </w:pPr>
       <w:hyperlink w:anchor="bssc_section_9">
         <w:r>
@@ -204,6 +214,7 @@
     <w:p>
       <w:pPr>
         <w:spacing w:after="220"/>
+        <w:jc w:val="center"/>
       </w:pPr>
       <w:hyperlink w:anchor="bssc_section_10">
         <w:r>
@@ -217,6 +228,7 @@
     <w:p>
       <w:pPr>
         <w:spacing w:after="220"/>
+        <w:jc w:val="center"/>
       </w:pPr>
       <w:hyperlink w:anchor="bssc_section_11">
         <w:r>
@@ -230,6 +242,7 @@
     <w:p>
       <w:pPr>
         <w:spacing w:after="220"/>
+        <w:jc w:val="center"/>
       </w:pPr>
       <w:hyperlink w:anchor="bssc_section_12">
         <w:r>
@@ -243,6 +256,7 @@
     <w:p>
       <w:pPr>
         <w:spacing w:before="300"/>
+        <w:jc w:val="center"/>
       </w:pPr>
       <w:r>
         <w:t>Select a heading to jump to that section.</w:t>
@@ -1290,7 +1304,7 @@
                 <w:rFonts w:ascii="Calibri" w:hAnsi="Calibri"/>
                 <w:b/>
                 <w:color w:val="FFFFFF"/>
-                <w:sz w:val="21"/>
+                <w:sz w:val="24"/>
               </w:rPr>
               <w:t>Eligible voting members</w:t>
             </w:r>
@@ -1323,7 +1337,7 @@
                 <w:rFonts w:ascii="Calibri" w:hAnsi="Calibri"/>
                 <w:b/>
                 <w:color w:val="FFFFFF"/>
-                <w:sz w:val="21"/>
+                <w:sz w:val="24"/>
               </w:rPr>
               <w:t>Directors</w:t>
             </w:r>
@@ -1361,7 +1375,7 @@
                 <w:rFonts w:ascii="Calibri" w:hAnsi="Calibri"/>
                 <w:b w:val="0"/>
                 <w:color w:val="111111"/>
-                <w:sz w:val="21"/>
+                <w:sz w:val="24"/>
               </w:rPr>
               <w:t>1 through 35</w:t>
             </w:r>
@@ -1394,7 +1408,7 @@
                 <w:rFonts w:ascii="Calibri" w:hAnsi="Calibri"/>
                 <w:b w:val="0"/>
                 <w:color w:val="111111"/>
-                <w:sz w:val="21"/>
+                <w:sz w:val="24"/>
               </w:rPr>
               <w:t>5</w:t>
             </w:r>
@@ -1432,7 +1446,7 @@
                 <w:rFonts w:ascii="Calibri" w:hAnsi="Calibri"/>
                 <w:b w:val="0"/>
                 <w:color w:val="111111"/>
-                <w:sz w:val="21"/>
+                <w:sz w:val="24"/>
               </w:rPr>
               <w:t>36 through 60</w:t>
             </w:r>
@@ -1465,7 +1479,7 @@
                 <w:rFonts w:ascii="Calibri" w:hAnsi="Calibri"/>
                 <w:b w:val="0"/>
                 <w:color w:val="111111"/>
-                <w:sz w:val="21"/>
+                <w:sz w:val="24"/>
               </w:rPr>
               <w:t>7</w:t>
             </w:r>
@@ -1503,7 +1517,7 @@
                 <w:rFonts w:ascii="Calibri" w:hAnsi="Calibri"/>
                 <w:b w:val="0"/>
                 <w:color w:val="111111"/>
-                <w:sz w:val="21"/>
+                <w:sz w:val="24"/>
               </w:rPr>
               <w:t>61 through 85</w:t>
             </w:r>
@@ -1536,7 +1550,7 @@
                 <w:rFonts w:ascii="Calibri" w:hAnsi="Calibri"/>
                 <w:b w:val="0"/>
                 <w:color w:val="111111"/>
-                <w:sz w:val="21"/>
+                <w:sz w:val="24"/>
               </w:rPr>
               <w:t>9</w:t>
             </w:r>
@@ -1574,7 +1588,7 @@
                 <w:rFonts w:ascii="Calibri" w:hAnsi="Calibri"/>
                 <w:b w:val="0"/>
                 <w:color w:val="111111"/>
-                <w:sz w:val="21"/>
+                <w:sz w:val="24"/>
               </w:rPr>
               <w:t>86 or more</w:t>
             </w:r>
@@ -1607,7 +1621,7 @@
                 <w:rFonts w:ascii="Calibri" w:hAnsi="Calibri"/>
                 <w:b w:val="0"/>
                 <w:color w:val="111111"/>
-                <w:sz w:val="21"/>
+                <w:sz w:val="24"/>
               </w:rPr>
               <w:t>11</w:t>
             </w:r>
@@ -2465,7 +2479,7 @@
                 <w:rFonts w:ascii="Calibri" w:hAnsi="Calibri"/>
                 <w:b/>
                 <w:color w:val="FFFFFF"/>
-                <w:sz w:val="21"/>
+                <w:sz w:val="24"/>
               </w:rPr>
               <w:t>Ordinary operating commitment</w:t>
             </w:r>
@@ -2498,7 +2512,7 @@
                 <w:rFonts w:ascii="Calibri" w:hAnsi="Calibri"/>
                 <w:b/>
                 <w:color w:val="FFFFFF"/>
-                <w:sz w:val="21"/>
+                <w:sz w:val="24"/>
               </w:rPr>
               <w:t>Required approval</w:t>
             </w:r>
@@ -2536,7 +2550,7 @@
                 <w:rFonts w:ascii="Calibri" w:hAnsi="Calibri"/>
                 <w:b w:val="0"/>
                 <w:color w:val="111111"/>
-                <w:sz w:val="21"/>
+                <w:sz w:val="24"/>
               </w:rPr>
               <w:t>Up to and including $250</w:t>
             </w:r>
@@ -2569,7 +2583,7 @@
                 <w:rFonts w:ascii="Calibri" w:hAnsi="Calibri"/>
                 <w:b w:val="0"/>
                 <w:color w:val="111111"/>
-                <w:sz w:val="21"/>
+                <w:sz w:val="24"/>
               </w:rPr>
               <w:t>Treasurer with notice to President and Vice President</w:t>
             </w:r>
@@ -2607,7 +2621,7 @@
                 <w:rFonts w:ascii="Calibri" w:hAnsi="Calibri"/>
                 <w:b w:val="0"/>
                 <w:color w:val="111111"/>
-                <w:sz w:val="21"/>
+                <w:sz w:val="24"/>
               </w:rPr>
               <w:t>More than $250 through $1000</w:t>
             </w:r>
@@ -2640,7 +2654,7 @@
                 <w:rFonts w:ascii="Calibri" w:hAnsi="Calibri"/>
                 <w:b w:val="0"/>
                 <w:color w:val="111111"/>
-                <w:sz w:val="21"/>
+                <w:sz w:val="24"/>
               </w:rPr>
               <w:t>President Vice President and Treasurer jointly</w:t>
             </w:r>
@@ -2678,7 +2692,7 @@
                 <w:rFonts w:ascii="Calibri" w:hAnsi="Calibri"/>
                 <w:b w:val="0"/>
                 <w:color w:val="111111"/>
-                <w:sz w:val="21"/>
+                <w:sz w:val="24"/>
               </w:rPr>
               <w:t>More than $1000</w:t>
             </w:r>
@@ -2711,7 +2725,7 @@
                 <w:rFonts w:ascii="Calibri" w:hAnsi="Calibri"/>
                 <w:b w:val="0"/>
                 <w:color w:val="111111"/>
-                <w:sz w:val="21"/>
+                <w:sz w:val="24"/>
               </w:rPr>
               <w:t>Board approval</w:t>
             </w:r>
@@ -3775,7 +3789,8 @@
     <w:rPr>
       <w:rFonts w:ascii="Calibri" w:hAnsi="Calibri"/>
       <w:color w:val="111111"/>
-      <w:sz w:val="22"/>
+      <w:sz w:val="24"/>
+      <w:szCs w:val="24"/>
     </w:rPr>
   </w:style>
   <w:style w:type="paragraph" w:styleId="Header">
@@ -4052,6 +4067,10 @@
         <w:right w:w="108" w:type="dxa"/>
       </w:tblCellMar>
     </w:tblPr>
+    <w:rPr>
+      <w:sz w:val="24"/>
+      <w:szCs w:val="24"/>
+    </w:rPr>
   </w:style>
   <w:style w:type="numbering" w:default="1" w:styleId="NoList">
     <w:name w:val="No List"/>
@@ -4208,6 +4227,10 @@
     <w:pPr>
       <w:spacing w:after="120"/>
     </w:pPr>
+    <w:rPr>
+      <w:sz w:val="24"/>
+      <w:szCs w:val="24"/>
+    </w:rPr>
   </w:style>
   <w:style w:type="character" w:customStyle="1" w:styleId="BodyTextChar">
     <w:name w:val="Body Text Char"/>

</xml_diff>